<commit_message>
updated abstract and base
</commit_message>
<xml_diff>
--- a/mysite/generated_docs/Ai_Image_Processing_ZerothReview.docx
+++ b/mysite/generated_docs/Ai_Image_Processing_ZerothReview.docx
@@ -1784,7 +1784,7 @@
           </w:tcPr>
           <w:p>
             <w:r>
-              <w:t>8</w:t>
+              <w:t>20</w:t>
             </w:r>
           </w:p>
         </w:tc>
@@ -1796,7 +1796,7 @@
           </w:tcPr>
           <w:p>
             <w:r>
-              <w:t>8</w:t>
+              <w:t>20</w:t>
             </w:r>
           </w:p>
         </w:tc>
@@ -1808,7 +1808,7 @@
           </w:tcPr>
           <w:p>
             <w:r>
-              <w:t>8</w:t>
+              <w:t>20</w:t>
             </w:r>
           </w:p>
         </w:tc>
@@ -2122,7 +2122,7 @@
           </w:tcPr>
           <w:p>
             <w:r>
-              <w:t>15</w:t>
+              <w:t>20</w:t>
             </w:r>
           </w:p>
         </w:tc>
@@ -2134,7 +2134,7 @@
           </w:tcPr>
           <w:p>
             <w:r>
-              <w:t>15</w:t>
+              <w:t>20</w:t>
             </w:r>
           </w:p>
         </w:tc>
@@ -2146,7 +2146,7 @@
           </w:tcPr>
           <w:p>
             <w:r>
-              <w:t>15</w:t>
+              <w:t>20</w:t>
             </w:r>
           </w:p>
         </w:tc>
@@ -2291,7 +2291,7 @@
           </w:tcPr>
           <w:p>
             <w:r>
-              <w:t>14</w:t>
+              <w:t>20</w:t>
             </w:r>
           </w:p>
         </w:tc>
@@ -2303,7 +2303,7 @@
           </w:tcPr>
           <w:p>
             <w:r>
-              <w:t>14</w:t>
+              <w:t>20</w:t>
             </w:r>
           </w:p>
         </w:tc>
@@ -2315,7 +2315,7 @@
           </w:tcPr>
           <w:p>
             <w:r>
-              <w:t>14</w:t>
+              <w:t>20</w:t>
             </w:r>
           </w:p>
         </w:tc>
@@ -2456,7 +2456,7 @@
           </w:tcPr>
           <w:p>
             <w:r>
-              <w:t>19</w:t>
+              <w:t>18</w:t>
             </w:r>
           </w:p>
         </w:tc>
@@ -2468,7 +2468,7 @@
           </w:tcPr>
           <w:p>
             <w:r>
-              <w:t>19</w:t>
+              <w:t>18</w:t>
             </w:r>
           </w:p>
         </w:tc>
@@ -2480,7 +2480,7 @@
           </w:tcPr>
           <w:p>
             <w:r>
-              <w:t>19</w:t>
+              <w:t>18</w:t>
             </w:r>
           </w:p>
         </w:tc>
@@ -2627,7 +2627,7 @@
           </w:tcPr>
           <w:p>
             <w:r>
-              <w:t>10</w:t>
+              <w:t>6</w:t>
             </w:r>
           </w:p>
         </w:tc>
@@ -2639,7 +2639,7 @@
           </w:tcPr>
           <w:p>
             <w:r>
-              <w:t>9</w:t>
+              <w:t>4</w:t>
             </w:r>
           </w:p>
         </w:tc>
@@ -2651,7 +2651,7 @@
           </w:tcPr>
           <w:p>
             <w:r>
-              <w:t>10</w:t>
+              <w:t>8</w:t>
             </w:r>
           </w:p>
         </w:tc>
@@ -2765,7 +2765,7 @@
           </w:tcPr>
           <w:p>
             <w:r>
-              <w:t>76</w:t>
+              <w:t>94</w:t>
             </w:r>
           </w:p>
         </w:tc>
@@ -2777,7 +2777,7 @@
           </w:tcPr>
           <w:p>
             <w:r>
-              <w:t>75</w:t>
+              <w:t>92</w:t>
             </w:r>
           </w:p>
         </w:tc>
@@ -2789,7 +2789,7 @@
           </w:tcPr>
           <w:p>
             <w:r>
-              <w:t>76</w:t>
+              <w:t>96</w:t>
             </w:r>
           </w:p>
         </w:tc>

</xml_diff>